<commit_message>
docs: update final scientific report
</commit_message>
<xml_diff>
--- a/docs/Rapport_Protein_Solubility_FINAL.docx
+++ b/docs/Rapport_Protein_Solubility_FINAL.docx
@@ -102,7 +102,7 @@
     </w:p>
     <w:p>
       <w:r>
-        <w:t>État du projet : démonstrateur publié — 25 octobre 2026</w:t>
+        <w:t>État du projet : démonstrateur publié ; documentation et preuves d’évaluation mises à jour au 29 octobre 2026.</w:t>
       </w:r>
     </w:p>
     <w:p>
@@ -1141,17 +1141,8 @@
             </w:tcMar>
           </w:tcPr>
           <w:p>
-            <w:pPr>
-              <w:spacing w:after="0" w:before="0" w:line="240" w:lineRule="auto"/>
-            </w:pPr>
-            <w:r>
-              <w:rPr>
-                <w:rFonts w:ascii="Aptos" w:hAnsi="Aptos"/>
-                <w:b w:val="0"/>
-                <w:color w:val="1B303E"/>
-                <w:sz w:val="15"/>
-              </w:rPr>
-              <w:t>17 à 20</w:t>
+            <w:r>
+              <w:t>17 à 23</w:t>
             </w:r>
           </w:p>
         </w:tc>
@@ -2779,7 +2770,7 @@
           </w:tcPr>
           <w:p>
             <w:r>
-              <w:t>Répartie en deux sous-ensembles distincts (séparation par groupes d’homologie) : l’un ajuste le calibrateur de Platt, l’autre fixe le seuil économique.</w:t>
+              <w:t>Répartie en deux groupes distincts de 2 026 protéines chacun (homologie approchée) : calibration Platt sur le premier, sélection du seuil sur le second ; pas de test final indépendant.</w:t>
             </w:r>
           </w:p>
         </w:tc>
@@ -2845,7 +2836,7 @@
     </w:p>
     <w:p>
       <w:r>
-        <w:t>Pourquoi séparer ? Fit sert à entraîner le modèle ; Calibration a déjà servi à l’arrêt anticipé du fine-tuning (sélection d’époque). Tune a guidé les comparaisons d’architectures et ne constitue plus un test indépendant. Pour finaliser le modèle retenu, Threshold a été réparti en deux sous-ensembles distincts, avec séparation approchée par groupes d’homologie : le premier ajuste le calibrateur probabiliste Platt ; le second sert à choisir le seuil économique. Ces jeux consommés pendant la mise au point ne doivent pas être réutilisés pour revendiquer une performance finale indépendante. MMseqs2 limite les risques d’homologie sans garantir leur élimination exhaustive.</w:t>
+        <w:t>Pourquoi séparer ? Fit (46 270 protéines) sert à apprendre les paramètres du modèle. Calibration (4 052) a été utilisée pendant la campagne pour sélectionner l’époque et l’arrêt anticipé du fine-tuning : elle est donc déjà consommée. Tune (4 052) a guidé le choix des architectures et ne peut pas être présenté comme un test indépendant. Lors de la finalisation, Threshold (4 052) a été séparé en deux sous-ensembles distincts de 2 026 protéines chacun, selon des groupes d’homologie approximatifs : l’un ajuste le calibrateur de Platt sur les logits, l’autre sélectionne le seuil sous contrainte de rappel. Les deux sous-ensembles participent au réglage ; aucun ne constitue un test final indépendant. L’audit MMseqs2 est approché et n’exclut pas toutes les homologies possibles.</w:t>
       </w:r>
     </w:p>
     <w:p>
@@ -3204,11 +3195,6 @@
       <w:pPr>
         <w:spacing w:after="20"/>
       </w:pPr>
-    </w:p>
-    <w:p>
-      <w:r>
-        <w:br w:type="page"/>
-      </w:r>
     </w:p>
     <w:p>
       <w:pPr>
@@ -4523,7 +4509,7 @@
     </w:p>
     <w:p>
       <w:r>
-        <w:t>L’indicateur AUC ROC représente la capacité de discrimination entre soluble et insoluble. Le score de référence 0,832857 (PR-AUC 0,786022) est mesuré sur Tune (4 052 protéines), réutilisé pendant la sélection du modèle : c’est un résultat exploratoire de développement, et non une estimation finale indépendante. Les scripts et exports de traçabilité (version, partition et métriques) sont décrits en annexe E.</w:t>
+        <w:t>L’AUC ROC mesure la capacité du modèle à distinguer les protéines solubles des insolubles. Le résultat de développement AUC ROC = 0,832857 (PR-AUC / average precision = 0,786022) a été obtenu sur Tune (n = 4 052), jeu déjà utilisé pour comparer et sélectionner les variantes. Ce n’est ni une performance finale indépendante, ni une preuve d’utilité expérimentale. Un export rétrospectif versionné (prédictions, métriques par tranche de longueur, manifeste et SHA-256) est désormais publié dans resultats/evaluation_v1/ ; la méthode et ses limites sont détaillées en annexes E et F.</w:t>
       </w:r>
     </w:p>
     <w:p>
@@ -6125,7 +6111,7 @@
     </w:p>
     <w:p>
       <w:r>
-        <w:t>Chiffrage transparent : scénario A = 14 jours-personne (6 500 €) + outils/stockage (500 €) = 7 000 €. Scénario B = A + 9 jours-personne (4 800 €) + GPU (700 €) = 12 500 €. Scénario C = B + 7 jours-personne (3 500 €) + 10 essais de laboratoire à 600 € (6 000 €) + réserve d’aléas (1 000 €) = 23 000 €. Les taux journaliers, postes et périmètres unitaires sont détaillés en annexe E. Il s’agit d’estimations prospectives hors taxes, non de coûts engagés ni de devis.</w:t>
+        <w:t>Chiffrage transparent, hypothèses cumulatives HT : A = 14 jours-personne (6 500 €) + outils/stockage (500 €), soit 7 000 €. B = A + 9 jours-personne (4 800 €) + GPU/infrastructure (700 €), soit 12 500 €. C = B + 7 jours-personne (3 500 €) + 10 essais de criblage portant sur 10 constructions (un essai exploratoire par construction, 600 € de frais directs chacun, soit 6 000 €) + une réserve d’aléas distincte (1 000 €), soit 23 000 €. Les tarifs journaliers, le périmètre des essais et les postes sont explicités en annexe E. Ce sont des estimations de pilotage et non des devis, dépenses engagées ou économies observées.</w:t>
       </w:r>
     </w:p>
     <w:p>
@@ -8341,7 +8327,7 @@
     </w:p>
     <w:p>
       <w:r>
-        <w:t>L’approche retenue est la meilleure observée sur Tune pendant le développement (AUC ROC 0,832857 ; PR-AUC 0,786022), mais ce jeu n’est pas indépendant de la sélection. Les tests automatiques documentent la livraison du démonstrateur, sans certifier une performance de généralisation. La prochaine étape proposée, non réalisée à ce stade, est une évaluation figée sur de nouvelles protéines avec audit des homologies et étude de la calibration, en particulier pour les séquences de 513 à 1 022 AA, suivie d’un éventuel pilote biologique comparatif.</w:t>
+        <w:t>La version retenue, ESM-2 150M partiellement fine-tuné avec Bio13, affiche les meilleurs résultats parmi les variantes comparées sur Tune (AUC ROC 0,832857 ; PR-AUC 0,786022), mais ce jeu a servi au développement et n’est pas une validation indépendante. Les exports rétrospectifs, les empreintes d’artefacts et le script d’évaluation rendent ces calculs inspectables, sans constituer une réexécution complète du checkpoint ni un contrôle d’homologie externe. La prochaine étape proposée, non réalisée, est une évaluation gelée sur une nouvelle cohorte de protéines, avec contrôle des homologies et vérification de la calibration, en particulier entre 513 et 1 022 AA, avant un pilote biologique.</w:t>
       </w:r>
     </w:p>
     <w:p>
@@ -10342,12 +10328,12 @@
     </w:p>
     <w:p>
       <w:r>
-        <w:t>Dans le script de finalisation du fine-tuning, Calibration historique est déjà consommée pour la sélection d’époque. La partition Threshold est ensuite divisée en deux sous-ensembles distincts par groupes d’homologie approchés : l’un sert à ajuster le calibrateur Platt, l’autre à sélectionner le seuil économique sous rappel minimal de 40 %. Les effectifs exacts par sous-ensemble doivent être repris du manifeste d’exécution ; une séparation par groupes ne garantit pas 2 026 / 2 026 exactement. La documentation disponible rapporte un seuil de 0,296491, un rappel de 0,8575 et un coût simulé de 387 600 € sur le sous-ensemble de sélection : ce sont des résultats de réglage interne, non des résultats de test indépendant.</w:t>
+        <w:t>La partition Calibration historique a été utilisée pour choisir l’époque et l’arrêt anticipé du fine-tuning. Le script de finalisation a ensuite séparé Threshold (4 052 protéines) en deux sous-ensembles distincts de 2 026 : Platt est ajusté sur le premier à partir des logits du checkpoint, puis le seuil économique est choisi sur le second (sans réentraînement). Le bilan d’exécution atteste n = 2 026 / 2 026, avec séparation approximative par groupes d’homologie MMseqs2 (identité ≥ 25 %, couverture ≥ 70 %, recherche plafonnée ; non exhaustive). Sur le sous-ensemble réservé au choix du seuil, le seuil figé est 0,296491, le rappel des solubles 0,8575 et le coût simulé 387 600 € (FN 114, FP 418 ; 1 200 €/FN, 600 €/FP). Il s’agit de métriques de réglage interne et non de performances finales indépendantes.</w:t>
       </w:r>
     </w:p>
     <w:p>
       <w:r>
-        <w:t>Le jeu Tune a déjà servi au choix des architectures : son AUC de 0,832857 n’est pas une performance indépendante. Le holdout historique ne peut pas être recyclé comme évaluation nouvelle du modèle fine-tuné. Sans prédictions horodatées et données non consommées, aucune nouvelle métrique finale ne peut être calculée honnêtement ; l’annexe E décrit les scripts pour documenter ces résultats dès qu’une cohorte inédite sera disponible.</w:t>
+        <w:t>L’AUC ROC de 0,832857 sur Tune ne doit pas être présentée comme indépendante. Un export rétrospectif de Tune (4 052 lignes) permet désormais de recalculer les métriques descriptives et une matrice de confusion pour la variante fine-tunée au seuil déjà fixé ; ces résultats sont documentés en annexe F. Les probabilités calibrées de cet export ont été reconstruites à partir des probabilités historiques du modèle (transformation logit inverse) puis du calibrateur Platt figé : ce n’est pas une nouvelle inférence directe sur les logits d’origine, notamment pour les scores saturés. Le holdout déjà consulté lors d’autres essais ne constitue pas une cohorte inédite ; aucun résultat final indépendant du fine-tuning n’est revendiqué.</w:t>
       </w:r>
     </w:p>
     <w:p>
@@ -10849,7 +10835,7 @@
     </w:p>
     <w:p>
       <w:r>
-        <w:t>Documentation technique : README, docs/ARCHITECTURE.md, docs/RESULTATS_ET_LIMITES.md et journal CHANGELOG.</w:t>
+        <w:t>Documentation et preuves du dépôt : README.md ; docs/ARCHITECTURE.md ; docs/RESULTATS_ET_LIMITES.md ; docs/NOTE_EVALUATION.md ; docs/PROTOCOLE_EVALUATION.md ; scripts/evaluer_predictions_figees.py ; resultats/evaluation_v1/ (CSV de prédictions, métriques, manifeste et bilan de calibration/seuil).</w:t>
       </w:r>
     </w:p>
     <w:p>
@@ -10958,7 +10944,7 @@
     </w:p>
     <w:p>
       <w:r>
-        <w:t>Unités et périmètres proposés pour discussion avec le responsable de laboratoire ; montants illustratifs HT, non engagés. J = jour-personne. Un essai à 600 € couvre ici les consommables et frais de plateforme d’un premier criblage par construction, mais pas les journées scientifiques déjà comptées. La réserve d’aléas ne finance pas une seconde fois les mêmes essais.</w:t>
+        <w:t>Unités et périmètres proposés pour arbitrage avec un laboratoire ; montants illustratifs HT, non engagés. J = jour-personne. Les 600 € par essai sont une hypothèse de consommables et frais de plateforme pour un premier criblage de 10 constructions (un essai par construction), hors journées scientifiques déjà comptabilisées. Ils ne désignent ni un cycle complet à 2 000 € ni le coût théorique de faux positif du seuil. La réserve d’aléas est séparée des postes déjà budgétés et ne finance pas une seconde fois les mêmes essais.</w:t>
       </w:r>
     </w:p>
     <w:tbl>
@@ -11754,14 +11740,8 @@
             <w:tcW w:type="dxa" w:w="2388"/>
           </w:tcPr>
           <w:p>
-            <w:pPr>
-              <w:spacing w:after="40" w:before="40"/>
-            </w:pPr>
-            <w:r>
-              <w:rPr>
-                <w:sz w:val="16"/>
-              </w:rPr>
-              <w:t>C • 10 criblages par construction (hors travail humain)</w:t>
+            <w:r>
+              <w:t>C • criblage de 10 constructions (1 essai chacune, frais directs hors main-d’œuvre)</w:t>
             </w:r>
           </w:p>
         </w:tc>
@@ -12042,7 +12022,7 @@
     </w:p>
     <w:p>
       <w:r>
-        <w:t>Dossier livré avec ce rapport : scripts/evaluer_predictions_figees.py (métriques, export CSV/JSON, SHA-256, comparaison par tranche de longueur), resultats/resultats_developpement_documentes.csv (scores historiques publiés sur Tune) et docs/PROTOCOLE_EVALUATION.md. Ces fichiers ne réalisent pas une nouvelle inférence sans checkpoint ni données d’entrée ; ils ne produisent aucune évaluation externe fictive.</w:t>
+        <w:t>Chaîne de preuve publiée sur GitHub (branche main) : scripts/evaluer_predictions_figees.py (calcul de métriques en lecture seule, sans inférence) ; docs/NOTE_EVALUATION.md et docs/PROTOCOLE_EVALUATION.md (rôles des partitions et limites) ; resultats/evaluation_v1/predictions_tune_retrospectives.csv (4 052 prédictions d’entrée) ; resultats/evaluation_v1/metriques_par_partition.csv et evaluation_manifest.json (métriques par longueur, version et empreintes SHA-256) ; resultats/evaluation_v1/bilan_calibration_seuil.json (effectifs 2 026 / 2 026, Platt et seuil). Le script recalcule les mesures à partir du CSV ; il n’effectue ni nouvelle inférence ESM-2, ni audit d’homologie externe. Les scores d’entrée ont été obtenus par reconstruction numérique de logits à partir de probabilités historiques : les mesures de calibration associées restent exploratoires et doivent être comparées aux logits d’origine avant toute affirmation de calibration vérifiée.</w:t>
       </w:r>
     </w:p>
     <w:tbl>
@@ -12255,10 +12235,7 @@
           </w:tcPr>
           <w:p>
             <w:r>
-              <w:rPr>
-                <w:sz w:val="16"/>
-              </w:rPr>
-              <w:t>Deux sous-ensembles disjoints : calibration Platt / sélection du seuil</w:t>
+              <w:t>4 052, puis deux groupes disjoints de 2 026 : Platt (logits) et choix du seuil ; homologie MMseqs2 approchée.</w:t>
             </w:r>
           </w:p>
         </w:tc>
@@ -12268,10 +12245,7 @@
           </w:tcPr>
           <w:p>
             <w:r>
-              <w:rPr>
-                <w:sz w:val="16"/>
-              </w:rPr>
-              <w:t>Réglage, métriques internes uniquement</w:t>
+              <w:t>Réglage interne, non indépendant.</w:t>
             </w:r>
           </w:p>
         </w:tc>
@@ -12375,7 +12349,7 @@
     </w:p>
     <w:p>
       <w:r>
-        <w:t>Avant l’accès à une cohorte nouvelle, figer les empreintes du checkpoint et du calibrateur, le seuil, la politique de longueur, la liste des métriques et la définition de « soluble ». Dédupliquer et auditer les homologies contre les jeux déjà utilisés. Exporter pour chaque protéine ID, longueur, groupe, label, probabilité calibrée, partition et provenance. Exécuter l’évaluation une seule fois sans réoptimisation. Examiner par tranche ≤ 512 AA / 513–1 022 AA / &gt; 1 022 AA les AUC, PR-AUC, Brier, ECE, rappel, précision, taux de faux positifs et matrices de confusion ; les sous-groupes de faible effectif restent exploratoires. Pour 513–1 022 AA, vérifier et, au besoin, recalibrer sur des données distinctes avant toute décision de production.</w:t>
+        <w:t>Avant l’accès à une cohorte nouvelle, préenregistrer le protocole et figer le checkpoint (SHA-256), le calibrateur (SHA-256), le seuil, la politique de longueur, la définition expérimentale de « soluble » et les métriques. Dédupliquer et auditer les homologies par rapport à toutes les partitions déjà exploitées, en documentant identité, couverture et cas ambigus. Exporter les identifiants, longueurs, groupes, labels, scores calibrés et provenance ; évaluer une seule fois sans réoptimiser après observation. Rapporter AUC ROC, PR-AUC, Brier, ECE, rappel, précision et matrice de confusion avec les effectifs, pour l’ensemble et par tranche ≤ 512 AA, 513–1 022 AA, &gt; 1 022 AA. Pour 513–1 022 AA, recalibrer sur des données distinctes si nécessaire. Cette validation indépendante et le pilote biologique comparatif constituent des perspectives NON réalisées.</w:t>
       </w:r>
     </w:p>
     <w:p>
@@ -12388,7 +12362,1217 @@
         <w:pStyle w:val="Smallnote"/>
       </w:pPr>
       <w:r>
-        <w:t>Document corrigé après retours mentor, 28 octobre 2026. Les nouvelles hypothèses budgétaires sont explicitement proposées et ne reflètent pas des dépenses vérifiées.</w:t>
+        <w:t>Version documentaire du 29 octobre 2026. Les budgets sont des hypothèses prospectives ; les évaluations rétrospectives sur Tune ne constituent pas une validation indépendante.</w:t>
+      </w:r>
+    </w:p>
+    <w:p>
+      <w:r>
+        <w:br w:type="page"/>
+      </w:r>
+    </w:p>
+    <w:p>
+      <w:pPr>
+        <w:pStyle w:val="Eyebrow"/>
+      </w:pPr>
+      <w:r>
+        <w:t>7. ANNEXES</w:t>
+      </w:r>
+    </w:p>
+    <w:p>
+      <w:pPr>
+        <w:pStyle w:val="Heading1"/>
+      </w:pPr>
+      <w:r>
+        <w:t>Annexe F — Évaluation rétrospective et preuves de traçabilité</w:t>
+      </w:r>
+    </w:p>
+    <w:p>
+      <w:pPr>
+        <w:pStyle w:val="Heading2"/>
+      </w:pPr>
+      <w:r>
+        <w:t>F.1 Résultats documentés sur Tune (développement)</w:t>
+      </w:r>
+    </w:p>
+    <w:p>
+      <w:pPr/>
+      <w:r>
+        <w:t>Le tableau ci-dessous provient de resultats/evaluation_v1/metriques_par_partition.csv ; il correspond à la sortie du script d’évaluation exécuté en lecture seule sur un CSV reconstruit. Tous les résultats concernent le jeu DeepSol Tune déjà utilisé pendant le développement. La valeur 0,832857 n’est donc pas une mesure finale sur données inédites. Pour les longueurs supérieures à 512 AA, ces chiffres décrivent le protocole historique de troncature à 512 AA, pas une validation du mode expérimental à 1 022 AA.</w:t>
+      </w:r>
+    </w:p>
+    <w:tbl>
+      <w:tblPr>
+        <w:tblStyle w:val="TableGrid"/>
+        <w:tblW w:type="auto" w:w="0"/>
+        <w:jc w:val="center"/>
+        <w:tblLayout w:type="autofit"/>
+        <w:tblLook w:firstColumn="1" w:firstRow="1" w:lastColumn="0" w:lastRow="0" w:noHBand="0" w:noVBand="1" w:val="04A0"/>
+      </w:tblPr>
+      <w:tblGrid>
+        <w:gridCol w:w="1911"/>
+        <w:gridCol w:w="1911"/>
+        <w:gridCol w:w="1911"/>
+        <w:gridCol w:w="1911"/>
+        <w:gridCol w:w="1911"/>
+      </w:tblGrid>
+      <w:tr>
+        <w:trPr>
+          <w:tblHeader w:val="true"/>
+        </w:trPr>
+        <w:tc>
+          <w:tcPr>
+            <w:tcW w:type="dxa" w:w="1911"/>
+            <w:shd w:fill="173E4E"/>
+            <w:vAlign w:val="center"/>
+          </w:tcPr>
+          <w:p>
+            <w:pPr>
+              <w:spacing w:after="0" w:before="0" w:line="230" w:lineRule="auto"/>
+            </w:pPr>
+            <w:r>
+              <w:rPr>
+                <w:b/>
+                <w:color w:val="FFFFFF"/>
+                <w:sz w:val="11"/>
+              </w:rPr>
+              <w:t>Population / entrée 512 AA</w:t>
+            </w:r>
+          </w:p>
+        </w:tc>
+        <w:tc>
+          <w:tcPr>
+            <w:tcW w:type="dxa" w:w="1911"/>
+            <w:shd w:fill="173E4E"/>
+            <w:vAlign w:val="center"/>
+          </w:tcPr>
+          <w:p>
+            <w:pPr>
+              <w:spacing w:after="0" w:before="0" w:line="230" w:lineRule="auto"/>
+            </w:pPr>
+            <w:r>
+              <w:rPr>
+                <w:b/>
+                <w:color w:val="FFFFFF"/>
+                <w:sz w:val="11"/>
+              </w:rPr>
+              <w:t>N</w:t>
+            </w:r>
+          </w:p>
+        </w:tc>
+        <w:tc>
+          <w:tcPr>
+            <w:tcW w:type="dxa" w:w="1911"/>
+            <w:shd w:fill="173E4E"/>
+            <w:vAlign w:val="center"/>
+          </w:tcPr>
+          <w:p>
+            <w:pPr>
+              <w:spacing w:after="0" w:before="0" w:line="230" w:lineRule="auto"/>
+            </w:pPr>
+            <w:r>
+              <w:rPr>
+                <w:b/>
+                <w:color w:val="FFFFFF"/>
+                <w:sz w:val="11"/>
+              </w:rPr>
+              <w:t>AUC ROC</w:t>
+            </w:r>
+          </w:p>
+        </w:tc>
+        <w:tc>
+          <w:tcPr>
+            <w:tcW w:type="dxa" w:w="1911"/>
+            <w:shd w:fill="173E4E"/>
+            <w:vAlign w:val="center"/>
+          </w:tcPr>
+          <w:p>
+            <w:pPr>
+              <w:spacing w:after="0" w:before="0" w:line="230" w:lineRule="auto"/>
+            </w:pPr>
+            <w:r>
+              <w:rPr>
+                <w:b/>
+                <w:color w:val="FFFFFF"/>
+                <w:sz w:val="11"/>
+              </w:rPr>
+              <w:t>PR-AUC (AP)</w:t>
+            </w:r>
+          </w:p>
+        </w:tc>
+        <w:tc>
+          <w:tcPr>
+            <w:tcW w:type="dxa" w:w="1911"/>
+            <w:shd w:fill="173E4E"/>
+            <w:vAlign w:val="center"/>
+          </w:tcPr>
+          <w:p>
+            <w:pPr>
+              <w:spacing w:after="0" w:before="0" w:line="230" w:lineRule="auto"/>
+            </w:pPr>
+            <w:r>
+              <w:rPr>
+                <w:b/>
+                <w:color w:val="FFFFFF"/>
+                <w:sz w:val="11"/>
+              </w:rPr>
+              <w:t>Brier*</w:t>
+            </w:r>
+          </w:p>
+        </w:tc>
+      </w:tr>
+      <w:tr>
+        <w:tc>
+          <w:tcPr>
+            <w:tcW w:type="dxa" w:w="1911"/>
+            <w:vAlign w:val="center"/>
+          </w:tcPr>
+          <w:p>
+            <w:pPr>
+              <w:spacing w:after="0" w:before="0" w:line="230" w:lineRule="auto"/>
+            </w:pPr>
+            <w:r>
+              <w:rPr>
+                <w:sz w:val="11"/>
+              </w:rPr>
+              <w:t>Tune — ensemble</w:t>
+            </w:r>
+          </w:p>
+        </w:tc>
+        <w:tc>
+          <w:tcPr>
+            <w:tcW w:type="dxa" w:w="1911"/>
+            <w:vAlign w:val="center"/>
+          </w:tcPr>
+          <w:p>
+            <w:pPr>
+              <w:spacing w:after="0" w:before="0" w:line="230" w:lineRule="auto"/>
+            </w:pPr>
+            <w:r>
+              <w:rPr>
+                <w:sz w:val="11"/>
+              </w:rPr>
+              <w:t>4 052</w:t>
+            </w:r>
+          </w:p>
+        </w:tc>
+        <w:tc>
+          <w:tcPr>
+            <w:tcW w:type="dxa" w:w="1911"/>
+            <w:vAlign w:val="center"/>
+          </w:tcPr>
+          <w:p>
+            <w:pPr>
+              <w:spacing w:after="0" w:before="0" w:line="230" w:lineRule="auto"/>
+            </w:pPr>
+            <w:r>
+              <w:rPr>
+                <w:sz w:val="11"/>
+              </w:rPr>
+              <w:t>0,832857</w:t>
+            </w:r>
+          </w:p>
+        </w:tc>
+        <w:tc>
+          <w:tcPr>
+            <w:tcW w:type="dxa" w:w="1911"/>
+            <w:vAlign w:val="center"/>
+          </w:tcPr>
+          <w:p>
+            <w:pPr>
+              <w:spacing w:after="0" w:before="0" w:line="230" w:lineRule="auto"/>
+            </w:pPr>
+            <w:r>
+              <w:rPr>
+                <w:sz w:val="11"/>
+              </w:rPr>
+              <w:t>0,786022</w:t>
+            </w:r>
+          </w:p>
+        </w:tc>
+        <w:tc>
+          <w:tcPr>
+            <w:tcW w:type="dxa" w:w="1911"/>
+            <w:vAlign w:val="center"/>
+          </w:tcPr>
+          <w:p>
+            <w:pPr>
+              <w:spacing w:after="0" w:before="0" w:line="230" w:lineRule="auto"/>
+            </w:pPr>
+            <w:r>
+              <w:rPr>
+                <w:sz w:val="11"/>
+              </w:rPr>
+              <w:t>0,161064</w:t>
+            </w:r>
+          </w:p>
+        </w:tc>
+      </w:tr>
+      <w:tr>
+        <w:tc>
+          <w:tcPr>
+            <w:tcW w:type="dxa" w:w="1911"/>
+            <w:vAlign w:val="center"/>
+          </w:tcPr>
+          <w:p>
+            <w:pPr>
+              <w:spacing w:after="0" w:before="0" w:line="230" w:lineRule="auto"/>
+            </w:pPr>
+            <w:r>
+              <w:rPr>
+                <w:sz w:val="11"/>
+              </w:rPr>
+              <w:t>Longueur ≤ 512 AA</w:t>
+            </w:r>
+          </w:p>
+        </w:tc>
+        <w:tc>
+          <w:tcPr>
+            <w:tcW w:type="dxa" w:w="1911"/>
+            <w:vAlign w:val="center"/>
+          </w:tcPr>
+          <w:p>
+            <w:pPr>
+              <w:spacing w:after="0" w:before="0" w:line="230" w:lineRule="auto"/>
+            </w:pPr>
+            <w:r>
+              <w:rPr>
+                <w:sz w:val="11"/>
+              </w:rPr>
+              <w:t>3 672</w:t>
+            </w:r>
+          </w:p>
+        </w:tc>
+        <w:tc>
+          <w:tcPr>
+            <w:tcW w:type="dxa" w:w="1911"/>
+            <w:vAlign w:val="center"/>
+          </w:tcPr>
+          <w:p>
+            <w:pPr>
+              <w:spacing w:after="0" w:before="0" w:line="230" w:lineRule="auto"/>
+            </w:pPr>
+            <w:r>
+              <w:rPr>
+                <w:sz w:val="11"/>
+              </w:rPr>
+              <w:t>0,834522</w:t>
+            </w:r>
+          </w:p>
+        </w:tc>
+        <w:tc>
+          <w:tcPr>
+            <w:tcW w:type="dxa" w:w="1911"/>
+            <w:vAlign w:val="center"/>
+          </w:tcPr>
+          <w:p>
+            <w:pPr>
+              <w:spacing w:after="0" w:before="0" w:line="230" w:lineRule="auto"/>
+            </w:pPr>
+            <w:r>
+              <w:rPr>
+                <w:sz w:val="11"/>
+              </w:rPr>
+              <w:t>0,789178</w:t>
+            </w:r>
+          </w:p>
+        </w:tc>
+        <w:tc>
+          <w:tcPr>
+            <w:tcW w:type="dxa" w:w="1911"/>
+            <w:vAlign w:val="center"/>
+          </w:tcPr>
+          <w:p>
+            <w:pPr>
+              <w:spacing w:after="0" w:before="0" w:line="230" w:lineRule="auto"/>
+            </w:pPr>
+            <w:r>
+              <w:rPr>
+                <w:sz w:val="11"/>
+              </w:rPr>
+              <w:t>0,161005</w:t>
+            </w:r>
+          </w:p>
+        </w:tc>
+      </w:tr>
+      <w:tr>
+        <w:tc>
+          <w:tcPr>
+            <w:tcW w:type="dxa" w:w="1911"/>
+            <w:vAlign w:val="center"/>
+          </w:tcPr>
+          <w:p>
+            <w:pPr>
+              <w:spacing w:after="0" w:before="0" w:line="230" w:lineRule="auto"/>
+            </w:pPr>
+            <w:r>
+              <w:rPr>
+                <w:sz w:val="11"/>
+              </w:rPr>
+              <w:t>Longueur 513–1 022 AA</w:t>
+            </w:r>
+          </w:p>
+        </w:tc>
+        <w:tc>
+          <w:tcPr>
+            <w:tcW w:type="dxa" w:w="1911"/>
+            <w:vAlign w:val="center"/>
+          </w:tcPr>
+          <w:p>
+            <w:pPr>
+              <w:spacing w:after="0" w:before="0" w:line="230" w:lineRule="auto"/>
+            </w:pPr>
+            <w:r>
+              <w:rPr>
+                <w:sz w:val="11"/>
+              </w:rPr>
+              <w:t>360</w:t>
+            </w:r>
+          </w:p>
+        </w:tc>
+        <w:tc>
+          <w:tcPr>
+            <w:tcW w:type="dxa" w:w="1911"/>
+            <w:vAlign w:val="center"/>
+          </w:tcPr>
+          <w:p>
+            <w:pPr>
+              <w:spacing w:after="0" w:before="0" w:line="230" w:lineRule="auto"/>
+            </w:pPr>
+            <w:r>
+              <w:rPr>
+                <w:sz w:val="11"/>
+              </w:rPr>
+              <w:t>0,813852</w:t>
+            </w:r>
+          </w:p>
+        </w:tc>
+        <w:tc>
+          <w:tcPr>
+            <w:tcW w:type="dxa" w:w="1911"/>
+            <w:vAlign w:val="center"/>
+          </w:tcPr>
+          <w:p>
+            <w:pPr>
+              <w:spacing w:after="0" w:before="0" w:line="230" w:lineRule="auto"/>
+            </w:pPr>
+            <w:r>
+              <w:rPr>
+                <w:sz w:val="11"/>
+              </w:rPr>
+              <w:t>0,750544</w:t>
+            </w:r>
+          </w:p>
+        </w:tc>
+        <w:tc>
+          <w:tcPr>
+            <w:tcW w:type="dxa" w:w="1911"/>
+            <w:vAlign w:val="center"/>
+          </w:tcPr>
+          <w:p>
+            <w:pPr>
+              <w:spacing w:after="0" w:before="0" w:line="230" w:lineRule="auto"/>
+            </w:pPr>
+            <w:r>
+              <w:rPr>
+                <w:sz w:val="11"/>
+              </w:rPr>
+              <w:t>0,161934</w:t>
+            </w:r>
+          </w:p>
+        </w:tc>
+      </w:tr>
+      <w:tr>
+        <w:tc>
+          <w:tcPr>
+            <w:tcW w:type="dxa" w:w="1911"/>
+            <w:vAlign w:val="center"/>
+          </w:tcPr>
+          <w:p>
+            <w:pPr>
+              <w:spacing w:after="0" w:before="0" w:line="230" w:lineRule="auto"/>
+            </w:pPr>
+            <w:r>
+              <w:rPr>
+                <w:sz w:val="11"/>
+              </w:rPr>
+              <w:t>Longueur &gt; 1 022 AA</w:t>
+            </w:r>
+          </w:p>
+        </w:tc>
+        <w:tc>
+          <w:tcPr>
+            <w:tcW w:type="dxa" w:w="1911"/>
+            <w:vAlign w:val="center"/>
+          </w:tcPr>
+          <w:p>
+            <w:pPr>
+              <w:spacing w:after="0" w:before="0" w:line="230" w:lineRule="auto"/>
+            </w:pPr>
+            <w:r>
+              <w:rPr>
+                <w:sz w:val="11"/>
+              </w:rPr>
+              <w:t>20</w:t>
+            </w:r>
+          </w:p>
+        </w:tc>
+        <w:tc>
+          <w:tcPr>
+            <w:tcW w:type="dxa" w:w="1911"/>
+            <w:vAlign w:val="center"/>
+          </w:tcPr>
+          <w:p>
+            <w:pPr>
+              <w:spacing w:after="0" w:before="0" w:line="230" w:lineRule="auto"/>
+            </w:pPr>
+            <w:r>
+              <w:rPr>
+                <w:sz w:val="11"/>
+              </w:rPr>
+              <w:t>0,854167</w:t>
+            </w:r>
+          </w:p>
+        </w:tc>
+        <w:tc>
+          <w:tcPr>
+            <w:tcW w:type="dxa" w:w="1911"/>
+            <w:vAlign w:val="center"/>
+          </w:tcPr>
+          <w:p>
+            <w:pPr>
+              <w:spacing w:after="0" w:before="0" w:line="230" w:lineRule="auto"/>
+            </w:pPr>
+            <w:r>
+              <w:rPr>
+                <w:sz w:val="11"/>
+              </w:rPr>
+              <w:t>0,814782</w:t>
+            </w:r>
+          </w:p>
+        </w:tc>
+        <w:tc>
+          <w:tcPr>
+            <w:tcW w:type="dxa" w:w="1911"/>
+            <w:vAlign w:val="center"/>
+          </w:tcPr>
+          <w:p>
+            <w:pPr>
+              <w:spacing w:after="0" w:before="0" w:line="230" w:lineRule="auto"/>
+            </w:pPr>
+            <w:r>
+              <w:rPr>
+                <w:sz w:val="11"/>
+              </w:rPr>
+              <w:t>0,156193</w:t>
+            </w:r>
+          </w:p>
+        </w:tc>
+      </w:tr>
+    </w:tbl>
+    <w:p>
+      <w:pPr>
+        <w:pStyle w:val="Smallnote"/>
+      </w:pPr>
+      <w:r>
+        <w:t>* Brier et ECE sont calculés sur un export rétrospectif de probabilités Platt reconstituées à partir des probabilités historiques de la campagne (via une transformation logit inverse) : ils ne doivent pas être présentés comme une calibration externe vérifiée à partir de nouveaux logits. Sur l’ensemble de Tune, ECE (10 classes) = 0,028819 ; rappel = 0,812461 ; précision = 0,613128 au seuil historique 0,296491.</w:t>
+      </w:r>
+    </w:p>
+    <w:p>
+      <w:pPr>
+        <w:pStyle w:val="Heading2"/>
+      </w:pPr>
+      <w:r>
+        <w:t>F.2 Matrice de confusion rétrospective et coûts simulés</w:t>
+      </w:r>
+    </w:p>
+    <w:tbl>
+      <w:tblPr>
+        <w:tblStyle w:val="TableGrid"/>
+        <w:tblW w:type="auto" w:w="0"/>
+        <w:jc w:val="center"/>
+        <w:tblLayout w:type="autofit"/>
+        <w:tblLook w:firstColumn="1" w:firstRow="1" w:lastColumn="0" w:lastRow="0" w:noHBand="0" w:noVBand="1" w:val="04A0"/>
+      </w:tblPr>
+      <w:tblGrid>
+        <w:gridCol w:w="1592"/>
+        <w:gridCol w:w="1592"/>
+        <w:gridCol w:w="1592"/>
+        <w:gridCol w:w="1592"/>
+        <w:gridCol w:w="1592"/>
+        <w:gridCol w:w="1592"/>
+      </w:tblGrid>
+      <w:tr>
+        <w:trPr>
+          <w:tblHeader w:val="true"/>
+        </w:trPr>
+        <w:tc>
+          <w:tcPr>
+            <w:tcW w:type="dxa" w:w="1592"/>
+            <w:shd w:fill="173E4E"/>
+            <w:vAlign w:val="center"/>
+          </w:tcPr>
+          <w:p>
+            <w:pPr>
+              <w:spacing w:after="0" w:before="0" w:line="230" w:lineRule="auto"/>
+            </w:pPr>
+            <w:r>
+              <w:rPr>
+                <w:b/>
+                <w:color w:val="FFFFFF"/>
+                <w:sz w:val="11"/>
+              </w:rPr>
+              <w:t>Sous-ensemble</w:t>
+            </w:r>
+          </w:p>
+        </w:tc>
+        <w:tc>
+          <w:tcPr>
+            <w:tcW w:type="dxa" w:w="1592"/>
+            <w:shd w:fill="173E4E"/>
+            <w:vAlign w:val="center"/>
+          </w:tcPr>
+          <w:p>
+            <w:pPr>
+              <w:spacing w:after="0" w:before="0" w:line="230" w:lineRule="auto"/>
+            </w:pPr>
+            <w:r>
+              <w:rPr>
+                <w:b/>
+                <w:color w:val="FFFFFF"/>
+                <w:sz w:val="11"/>
+              </w:rPr>
+              <w:t>TN</w:t>
+            </w:r>
+          </w:p>
+        </w:tc>
+        <w:tc>
+          <w:tcPr>
+            <w:tcW w:type="dxa" w:w="1592"/>
+            <w:shd w:fill="173E4E"/>
+            <w:vAlign w:val="center"/>
+          </w:tcPr>
+          <w:p>
+            <w:pPr>
+              <w:spacing w:after="0" w:before="0" w:line="230" w:lineRule="auto"/>
+            </w:pPr>
+            <w:r>
+              <w:rPr>
+                <w:b/>
+                <w:color w:val="FFFFFF"/>
+                <w:sz w:val="11"/>
+              </w:rPr>
+              <w:t>FP</w:t>
+            </w:r>
+          </w:p>
+        </w:tc>
+        <w:tc>
+          <w:tcPr>
+            <w:tcW w:type="dxa" w:w="1592"/>
+            <w:shd w:fill="173E4E"/>
+            <w:vAlign w:val="center"/>
+          </w:tcPr>
+          <w:p>
+            <w:pPr>
+              <w:spacing w:after="0" w:before="0" w:line="230" w:lineRule="auto"/>
+            </w:pPr>
+            <w:r>
+              <w:rPr>
+                <w:b/>
+                <w:color w:val="FFFFFF"/>
+                <w:sz w:val="11"/>
+              </w:rPr>
+              <w:t>FN</w:t>
+            </w:r>
+          </w:p>
+        </w:tc>
+        <w:tc>
+          <w:tcPr>
+            <w:tcW w:type="dxa" w:w="1592"/>
+            <w:shd w:fill="173E4E"/>
+            <w:vAlign w:val="center"/>
+          </w:tcPr>
+          <w:p>
+            <w:pPr>
+              <w:spacing w:after="0" w:before="0" w:line="230" w:lineRule="auto"/>
+            </w:pPr>
+            <w:r>
+              <w:rPr>
+                <w:b/>
+                <w:color w:val="FFFFFF"/>
+                <w:sz w:val="11"/>
+              </w:rPr>
+              <w:t>TP</w:t>
+            </w:r>
+          </w:p>
+        </w:tc>
+        <w:tc>
+          <w:tcPr>
+            <w:tcW w:type="dxa" w:w="1592"/>
+            <w:shd w:fill="173E4E"/>
+            <w:vAlign w:val="center"/>
+          </w:tcPr>
+          <w:p>
+            <w:pPr>
+              <w:spacing w:after="0" w:before="0" w:line="230" w:lineRule="auto"/>
+            </w:pPr>
+            <w:r>
+              <w:rPr>
+                <w:b/>
+                <w:color w:val="FFFFFF"/>
+                <w:sz w:val="11"/>
+              </w:rPr>
+              <w:t>Coût simulé (€)</w:t>
+            </w:r>
+          </w:p>
+        </w:tc>
+      </w:tr>
+      <w:tr>
+        <w:tc>
+          <w:tcPr>
+            <w:tcW w:type="dxa" w:w="1592"/>
+            <w:vAlign w:val="center"/>
+          </w:tcPr>
+          <w:p>
+            <w:pPr>
+              <w:spacing w:after="0" w:before="0" w:line="230" w:lineRule="auto"/>
+            </w:pPr>
+            <w:r>
+              <w:rPr>
+                <w:sz w:val="11"/>
+              </w:rPr>
+              <w:t>Tune, n = 4 052</w:t>
+            </w:r>
+          </w:p>
+        </w:tc>
+        <w:tc>
+          <w:tcPr>
+            <w:tcW w:type="dxa" w:w="1592"/>
+            <w:vAlign w:val="center"/>
+          </w:tcPr>
+          <w:p>
+            <w:pPr>
+              <w:spacing w:after="0" w:before="0" w:line="230" w:lineRule="auto"/>
+            </w:pPr>
+            <w:r>
+              <w:rPr>
+                <w:sz w:val="11"/>
+              </w:rPr>
+              <w:t>1 600</w:t>
+            </w:r>
+          </w:p>
+        </w:tc>
+        <w:tc>
+          <w:tcPr>
+            <w:tcW w:type="dxa" w:w="1592"/>
+            <w:vAlign w:val="center"/>
+          </w:tcPr>
+          <w:p>
+            <w:pPr>
+              <w:spacing w:after="0" w:before="0" w:line="230" w:lineRule="auto"/>
+            </w:pPr>
+            <w:r>
+              <w:rPr>
+                <w:sz w:val="11"/>
+              </w:rPr>
+              <w:t>831</w:t>
+            </w:r>
+          </w:p>
+        </w:tc>
+        <w:tc>
+          <w:tcPr>
+            <w:tcW w:type="dxa" w:w="1592"/>
+            <w:vAlign w:val="center"/>
+          </w:tcPr>
+          <w:p>
+            <w:pPr>
+              <w:spacing w:after="0" w:before="0" w:line="230" w:lineRule="auto"/>
+            </w:pPr>
+            <w:r>
+              <w:rPr>
+                <w:sz w:val="11"/>
+              </w:rPr>
+              <w:t>304</w:t>
+            </w:r>
+          </w:p>
+        </w:tc>
+        <w:tc>
+          <w:tcPr>
+            <w:tcW w:type="dxa" w:w="1592"/>
+            <w:vAlign w:val="center"/>
+          </w:tcPr>
+          <w:p>
+            <w:pPr>
+              <w:spacing w:after="0" w:before="0" w:line="230" w:lineRule="auto"/>
+            </w:pPr>
+            <w:r>
+              <w:rPr>
+                <w:sz w:val="11"/>
+              </w:rPr>
+              <w:t>1 317</w:t>
+            </w:r>
+          </w:p>
+        </w:tc>
+        <w:tc>
+          <w:tcPr>
+            <w:tcW w:type="dxa" w:w="1592"/>
+            <w:vAlign w:val="center"/>
+          </w:tcPr>
+          <w:p>
+            <w:pPr>
+              <w:spacing w:after="0" w:before="0" w:line="230" w:lineRule="auto"/>
+            </w:pPr>
+            <w:r>
+              <w:rPr>
+                <w:sz w:val="11"/>
+              </w:rPr>
+              <w:t>863 400</w:t>
+            </w:r>
+          </w:p>
+        </w:tc>
+      </w:tr>
+      <w:tr>
+        <w:tc>
+          <w:tcPr>
+            <w:tcW w:type="dxa" w:w="1592"/>
+            <w:vAlign w:val="center"/>
+          </w:tcPr>
+          <w:p>
+            <w:pPr>
+              <w:spacing w:after="0" w:before="0" w:line="230" w:lineRule="auto"/>
+            </w:pPr>
+            <w:r>
+              <w:rPr>
+                <w:sz w:val="11"/>
+              </w:rPr>
+              <w:t>Threshold — choix seuil, n = 2 026</w:t>
+            </w:r>
+          </w:p>
+        </w:tc>
+        <w:tc>
+          <w:tcPr>
+            <w:tcW w:type="dxa" w:w="1592"/>
+            <w:vAlign w:val="center"/>
+          </w:tcPr>
+          <w:p>
+            <w:pPr>
+              <w:spacing w:after="0" w:before="0" w:line="230" w:lineRule="auto"/>
+            </w:pPr>
+            <w:r>
+              <w:rPr>
+                <w:sz w:val="11"/>
+              </w:rPr>
+              <w:t>808</w:t>
+            </w:r>
+          </w:p>
+        </w:tc>
+        <w:tc>
+          <w:tcPr>
+            <w:tcW w:type="dxa" w:w="1592"/>
+            <w:vAlign w:val="center"/>
+          </w:tcPr>
+          <w:p>
+            <w:pPr>
+              <w:spacing w:after="0" w:before="0" w:line="230" w:lineRule="auto"/>
+            </w:pPr>
+            <w:r>
+              <w:rPr>
+                <w:sz w:val="11"/>
+              </w:rPr>
+              <w:t>418</w:t>
+            </w:r>
+          </w:p>
+        </w:tc>
+        <w:tc>
+          <w:tcPr>
+            <w:tcW w:type="dxa" w:w="1592"/>
+            <w:vAlign w:val="center"/>
+          </w:tcPr>
+          <w:p>
+            <w:pPr>
+              <w:spacing w:after="0" w:before="0" w:line="230" w:lineRule="auto"/>
+            </w:pPr>
+            <w:r>
+              <w:rPr>
+                <w:sz w:val="11"/>
+              </w:rPr>
+              <w:t>114</w:t>
+            </w:r>
+          </w:p>
+        </w:tc>
+        <w:tc>
+          <w:tcPr>
+            <w:tcW w:type="dxa" w:w="1592"/>
+            <w:vAlign w:val="center"/>
+          </w:tcPr>
+          <w:p>
+            <w:pPr>
+              <w:spacing w:after="0" w:before="0" w:line="230" w:lineRule="auto"/>
+            </w:pPr>
+            <w:r>
+              <w:rPr>
+                <w:sz w:val="11"/>
+              </w:rPr>
+              <w:t>686</w:t>
+            </w:r>
+          </w:p>
+        </w:tc>
+        <w:tc>
+          <w:tcPr>
+            <w:tcW w:type="dxa" w:w="1592"/>
+            <w:vAlign w:val="center"/>
+          </w:tcPr>
+          <w:p>
+            <w:pPr>
+              <w:spacing w:after="0" w:before="0" w:line="230" w:lineRule="auto"/>
+            </w:pPr>
+            <w:r>
+              <w:rPr>
+                <w:sz w:val="11"/>
+              </w:rPr>
+              <w:t>387 600</w:t>
+            </w:r>
+          </w:p>
+        </w:tc>
+      </w:tr>
+    </w:tbl>
+    <w:p>
+      <w:pPr>
+        <w:pStyle w:val="Smallnote"/>
+      </w:pPr>
+      <w:r>
+        <w:t>Coût simulé = 1 200 € × faux négatifs + 600 € × faux positifs. Ces deux lignes ne sont pas interchangeables : sur Tune, le coût est un calcul rétrospectif après sélection ; sur Threshold, il s’agit du coût utilisé pour fixer le seuil. Ce ne sont ni des coûts de laboratoire observés, ni des économies constatées, ni des métriques indépendantes.</w:t>
+      </w:r>
+    </w:p>
+    <w:p>
+      <w:pPr>
+        <w:pStyle w:val="Heading2"/>
+      </w:pPr>
+      <w:r>
+        <w:t>F.3 Versions, fichiers consultables et limites</w:t>
+      </w:r>
+    </w:p>
+    <w:tbl>
+      <w:tblPr>
+        <w:tblStyle w:val="TableGrid"/>
+        <w:tblW w:type="auto" w:w="0"/>
+        <w:jc w:val="center"/>
+        <w:tblLayout w:type="autofit"/>
+        <w:tblLook w:firstColumn="1" w:firstRow="1" w:lastColumn="0" w:lastRow="0" w:noHBand="0" w:noVBand="1" w:val="04A0"/>
+      </w:tblPr>
+      <w:tblGrid>
+        <w:gridCol w:w="4776"/>
+        <w:gridCol w:w="4776"/>
+      </w:tblGrid>
+      <w:tr>
+        <w:trPr>
+          <w:tblHeader w:val="true"/>
+        </w:trPr>
+        <w:tc>
+          <w:tcPr>
+            <w:tcW w:type="dxa" w:w="4776"/>
+            <w:shd w:fill="173E4E"/>
+            <w:vAlign w:val="center"/>
+          </w:tcPr>
+          <w:p>
+            <w:pPr>
+              <w:spacing w:after="0" w:before="0" w:line="230" w:lineRule="auto"/>
+            </w:pPr>
+            <w:r>
+              <w:rPr>
+                <w:b/>
+                <w:color w:val="FFFFFF"/>
+                <w:sz w:val="11"/>
+              </w:rPr>
+              <w:t>Élément</w:t>
+            </w:r>
+          </w:p>
+        </w:tc>
+        <w:tc>
+          <w:tcPr>
+            <w:tcW w:type="dxa" w:w="4776"/>
+            <w:shd w:fill="173E4E"/>
+            <w:vAlign w:val="center"/>
+          </w:tcPr>
+          <w:p>
+            <w:pPr>
+              <w:spacing w:after="0" w:before="0" w:line="230" w:lineRule="auto"/>
+            </w:pPr>
+            <w:r>
+              <w:rPr>
+                <w:b/>
+                <w:color w:val="FFFFFF"/>
+                <w:sz w:val="11"/>
+              </w:rPr>
+              <w:t>Preuve publiée / rôle</w:t>
+            </w:r>
+          </w:p>
+        </w:tc>
+      </w:tr>
+      <w:tr>
+        <w:tc>
+          <w:tcPr>
+            <w:tcW w:type="dxa" w:w="4776"/>
+            <w:vAlign w:val="center"/>
+          </w:tcPr>
+          <w:p>
+            <w:pPr>
+              <w:spacing w:after="0" w:before="0" w:line="230" w:lineRule="auto"/>
+            </w:pPr>
+            <w:r>
+              <w:rPr>
+                <w:sz w:val="11"/>
+              </w:rPr>
+              <w:t>Architecture</w:t>
+            </w:r>
+          </w:p>
+        </w:tc>
+        <w:tc>
+          <w:tcPr>
+            <w:tcW w:type="dxa" w:w="4776"/>
+            <w:vAlign w:val="center"/>
+          </w:tcPr>
+          <w:p>
+            <w:pPr>
+              <w:spacing w:after="0" w:before="0" w:line="230" w:lineRule="auto"/>
+            </w:pPr>
+            <w:r>
+              <w:rPr>
+                <w:sz w:val="11"/>
+              </w:rPr>
+              <w:t>ESM-2 150M fine-tuné (2 dernières couches) + Bio13 ; version esm2_t30_150M_UR50D_finetune_last2_bio13</w:t>
+            </w:r>
+          </w:p>
+        </w:tc>
+      </w:tr>
+      <w:tr>
+        <w:tc>
+          <w:tcPr>
+            <w:tcW w:type="dxa" w:w="4776"/>
+            <w:vAlign w:val="center"/>
+          </w:tcPr>
+          <w:p>
+            <w:pPr>
+              <w:spacing w:after="0" w:before="0" w:line="230" w:lineRule="auto"/>
+            </w:pPr>
+            <w:r>
+              <w:rPr>
+                <w:sz w:val="11"/>
+              </w:rPr>
+              <w:t>Entrée rétrospective</w:t>
+            </w:r>
+          </w:p>
+        </w:tc>
+        <w:tc>
+          <w:tcPr>
+            <w:tcW w:type="dxa" w:w="4776"/>
+            <w:vAlign w:val="center"/>
+          </w:tcPr>
+          <w:p>
+            <w:pPr>
+              <w:spacing w:after="0" w:before="0" w:line="230" w:lineRule="auto"/>
+            </w:pPr>
+            <w:r>
+              <w:rPr>
+                <w:sz w:val="11"/>
+              </w:rPr>
+              <w:t>resultats/evaluation_v1/predictions_tune_retrospectives.csv — 4 052 lignes, partition Tune</w:t>
+            </w:r>
+          </w:p>
+        </w:tc>
+      </w:tr>
+      <w:tr>
+        <w:tc>
+          <w:tcPr>
+            <w:tcW w:type="dxa" w:w="4776"/>
+            <w:vAlign w:val="center"/>
+          </w:tcPr>
+          <w:p>
+            <w:pPr>
+              <w:spacing w:after="0" w:before="0" w:line="230" w:lineRule="auto"/>
+            </w:pPr>
+            <w:r>
+              <w:rPr>
+                <w:sz w:val="11"/>
+              </w:rPr>
+              <w:t>Résultats détaillés</w:t>
+            </w:r>
+          </w:p>
+        </w:tc>
+        <w:tc>
+          <w:tcPr>
+            <w:tcW w:type="dxa" w:w="4776"/>
+            <w:vAlign w:val="center"/>
+          </w:tcPr>
+          <w:p>
+            <w:pPr>
+              <w:spacing w:after="0" w:before="0" w:line="230" w:lineRule="auto"/>
+            </w:pPr>
+            <w:r>
+              <w:rPr>
+                <w:sz w:val="11"/>
+              </w:rPr>
+              <w:t>resultats/evaluation_v1/metriques_par_partition.csv et predictions_auditees.csv</w:t>
+            </w:r>
+          </w:p>
+        </w:tc>
+      </w:tr>
+      <w:tr>
+        <w:tc>
+          <w:tcPr>
+            <w:tcW w:type="dxa" w:w="4776"/>
+            <w:vAlign w:val="center"/>
+          </w:tcPr>
+          <w:p>
+            <w:pPr>
+              <w:spacing w:after="0" w:before="0" w:line="230" w:lineRule="auto"/>
+            </w:pPr>
+            <w:r>
+              <w:rPr>
+                <w:sz w:val="11"/>
+              </w:rPr>
+              <w:t>Manifeste de version</w:t>
+            </w:r>
+          </w:p>
+        </w:tc>
+        <w:tc>
+          <w:tcPr>
+            <w:tcW w:type="dxa" w:w="4776"/>
+            <w:vAlign w:val="center"/>
+          </w:tcPr>
+          <w:p>
+            <w:pPr>
+              <w:spacing w:after="0" w:before="0" w:line="230" w:lineRule="auto"/>
+            </w:pPr>
+            <w:r>
+              <w:rPr>
+                <w:sz w:val="11"/>
+              </w:rPr>
+              <w:t>resultats/evaluation_v1/evaluation_manifest.json — version, partition, seuil, SHA-256 et métriques</w:t>
+            </w:r>
+          </w:p>
+        </w:tc>
+      </w:tr>
+      <w:tr>
+        <w:tc>
+          <w:tcPr>
+            <w:tcW w:type="dxa" w:w="4776"/>
+            <w:vAlign w:val="center"/>
+          </w:tcPr>
+          <w:p>
+            <w:pPr>
+              <w:spacing w:after="0" w:before="0" w:line="230" w:lineRule="auto"/>
+            </w:pPr>
+            <w:r>
+              <w:rPr>
+                <w:sz w:val="11"/>
+              </w:rPr>
+              <w:t>Finalisation du seuil</w:t>
+            </w:r>
+          </w:p>
+        </w:tc>
+        <w:tc>
+          <w:tcPr>
+            <w:tcW w:type="dxa" w:w="4776"/>
+            <w:vAlign w:val="center"/>
+          </w:tcPr>
+          <w:p>
+            <w:pPr>
+              <w:spacing w:after="0" w:before="0" w:line="230" w:lineRule="auto"/>
+            </w:pPr>
+            <w:r>
+              <w:rPr>
+                <w:sz w:val="11"/>
+              </w:rPr>
+              <w:t>resultats/evaluation_v1/bilan_calibration_seuil.json — Platt sur 2 026 / seuil sur 2 026</w:t>
+            </w:r>
+          </w:p>
+        </w:tc>
+      </w:tr>
+      <w:tr>
+        <w:tc>
+          <w:tcPr>
+            <w:tcW w:type="dxa" w:w="4776"/>
+            <w:vAlign w:val="center"/>
+          </w:tcPr>
+          <w:p>
+            <w:pPr>
+              <w:spacing w:after="0" w:before="0" w:line="230" w:lineRule="auto"/>
+            </w:pPr>
+            <w:r>
+              <w:rPr>
+                <w:sz w:val="11"/>
+              </w:rPr>
+              <w:t>Reproduction analytique</w:t>
+            </w:r>
+          </w:p>
+        </w:tc>
+        <w:tc>
+          <w:tcPr>
+            <w:tcW w:type="dxa" w:w="4776"/>
+            <w:vAlign w:val="center"/>
+          </w:tcPr>
+          <w:p>
+            <w:pPr>
+              <w:spacing w:after="0" w:before="0" w:line="230" w:lineRule="auto"/>
+            </w:pPr>
+            <w:r>
+              <w:rPr>
+                <w:sz w:val="11"/>
+              </w:rPr>
+              <w:t>scripts/evaluer_predictions_figees.py — recalcule depuis le CSV fourni, sans GPU ni inférence</w:t>
+            </w:r>
+          </w:p>
+        </w:tc>
+      </w:tr>
+      <w:tr>
+        <w:tc>
+          <w:tcPr>
+            <w:tcW w:type="dxa" w:w="4776"/>
+            <w:vAlign w:val="center"/>
+          </w:tcPr>
+          <w:p>
+            <w:pPr>
+              <w:spacing w:after="0" w:before="0" w:line="230" w:lineRule="auto"/>
+            </w:pPr>
+            <w:r>
+              <w:rPr>
+                <w:sz w:val="11"/>
+              </w:rPr>
+              <w:t>Protocole et limites</w:t>
+            </w:r>
+          </w:p>
+        </w:tc>
+        <w:tc>
+          <w:tcPr>
+            <w:tcW w:type="dxa" w:w="4776"/>
+            <w:vAlign w:val="center"/>
+          </w:tcPr>
+          <w:p>
+            <w:pPr>
+              <w:spacing w:after="0" w:before="0" w:line="230" w:lineRule="auto"/>
+            </w:pPr>
+            <w:r>
+              <w:rPr>
+                <w:sz w:val="11"/>
+              </w:rPr>
+              <w:t>docs/NOTE_EVALUATION.md ; docs/PROTOCOLE_EVALUATION.md ; aucune cohorte externe évaluée</w:t>
+            </w:r>
+          </w:p>
+        </w:tc>
+      </w:tr>
+    </w:tbl>
+    <w:p>
+      <w:pPr/>
+      <w:r>
+        <w:t>Le manifeste contient les empreintes SHA-256 du checkpoint et du calibrateur, concordantes avec la finalisation. Le script recalcule des métriques à partir de prédictions enregistrées ; il ne prouve ni l’équivalence exacte avec les logits issus du checkpoint, ni l’indépendance des protéines. La validation externe, la calibration du mode 1 022 AA et le gain économique restent à établir.</w:t>
+      </w:r>
+    </w:p>
+    <w:p>
+      <w:pPr>
+        <w:pStyle w:val="Smallnote"/>
+      </w:pPr>
+      <w:r>
+        <w:t>Source : github.com/fatimaadda2878/protein-solubility-api · 29 octobre 2026.</w:t>
       </w:r>
     </w:p>
     <w:sectPr>
@@ -12415,7 +13599,7 @@
         <w:color w:val="52717C"/>
         <w:sz w:val="16"/>
       </w:rPr>
-      <w:t xml:space="preserve">Fatima ADDA-REZIG  •  25 octobre 2026   |   </w:t>
+      <w:t xml:space="preserve">Fatima ADDA-REZIG  •  29 octobre 2026   |   </w:t>
     </w:r>
     <w:fldSimple w:instr="PAGE"/>
   </w:p>

</xml_diff>